<commit_message>
fix(pbidoc): remove indicadores visíveis, gera sumário com páginas e evita títulos repetidos no docx
- Os títulos não levam mais indicadores (bookmarks) visíveis: o Google Docs
  desenhava uma fita azul antes de cada um. Só os títulos do sumário recebem
  indicador, sempre oculto (_Toc…).
- O sumário vira um campo TOC nativo (níveis 1 e 2) com número de página nos
  três documentos (negócio, técnico e relatório conectado); o índice por links
  internos sai, e o Word atualiza as páginas ao abrir (updateFields).
- O dicionário de dados agrupa, sob um único título e numa tabela, as colunas
  exibidas com o mesmo rótulo; títulos que coincidem com outro do documento
  ganham o complemento (campo) ou (medida).
- As páginas do relatório passam a título de nível 2 no documento de negócio.
- Remove os indicadores e os links internos dos documentos-modelo em
  docs/templates e tira o \n (sem páginas) do sumário do modelo de negócio;
  make_template.py descarta indicadores do logotipo da capa.
</commit_message>
<xml_diff>
--- a/docs/templates/Modelo - Documentacao Tecnica.docx
+++ b/docs/templates/Modelo - Documentacao Tecnica.docx
@@ -111,8 +111,6 @@
       <w:pPr>
         <w:pStyle w:val="Heading1"/>
       </w:pPr>
-      <w:bookmarkStart w:colFirst="0" w:colLast="0" w:name="sec_objetivo_4898f1" w:id="1"/>
-      <w:bookmarkEnd w:id="1"/>
       <w:r>
         <w:rPr>
           <w:rFonts w:ascii="Lato" w:cs="Lato" w:eastAsia="Lato" w:hAnsi="Lato"/>
@@ -146,8 +144,6 @@
       <w:pPr>
         <w:pStyle w:val="Heading1"/>
       </w:pPr>
-      <w:bookmarkStart w:colFirst="0" w:colLast="0" w:name="sec_infos_d599f3" w:id="2"/>
-      <w:bookmarkEnd w:id="2"/>
       <w:r>
         <w:rPr>
           <w:rFonts w:ascii="Lato" w:cs="Lato" w:eastAsia="Lato" w:hAnsi="Lato"/>
@@ -1488,8 +1484,6 @@
         <w:pStyle w:val="Heading1"/>
         <w:pageBreakBefore w:val="1"/>
       </w:pPr>
-      <w:bookmarkStart w:colFirst="0" w:colLast="0" w:name="sec_indice_8d5f90" w:id="3"/>
-      <w:bookmarkEnd w:id="3"/>
       <w:r>
         <w:rPr>
           <w:rFonts w:ascii="Lato" w:cs="Lato" w:eastAsia="Lato" w:hAnsi="Lato"/>
@@ -1542,18 +1536,16 @@
         <w:ind w:left="240"/>
         <w:jc w:val="left"/>
       </w:pPr>
-      <w:hyperlink w:anchor="sec_objetivo_4898f1">
-        <w:r>
-          <w:rPr>
-            <w:rFonts w:ascii="Lato Light" w:cs="Lato Light" w:eastAsia="Lato Light" w:hAnsi="Lato Light"/>
-            <w:color w:val="1aa6b7"/>
-            <w:sz w:val="22"/>
-            <w:szCs w:val="22"/>
-            <w:rtl w:val="0"/>
-          </w:rPr>
-          <w:t xml:space="preserve">Objetivo</w:t>
-        </w:r>
-      </w:hyperlink>
+      <w:r>
+        <w:rPr>
+          <w:rFonts w:ascii="Lato Light" w:cs="Lato Light" w:eastAsia="Lato Light" w:hAnsi="Lato Light"/>
+          <w:color w:val="1aa6b7"/>
+          <w:sz w:val="22"/>
+          <w:szCs w:val="22"/>
+          <w:rtl w:val="0"/>
+        </w:rPr>
+        <w:t xml:space="preserve">Objetivo</w:t>
+      </w:r>
     </w:p>
     <w:p>
       <w:pPr>
@@ -1561,18 +1553,16 @@
         <w:ind w:left="240"/>
         <w:jc w:val="left"/>
       </w:pPr>
-      <w:hyperlink w:anchor="sec_infos_d599f3">
-        <w:r>
-          <w:rPr>
-            <w:rFonts w:ascii="Lato Light" w:cs="Lato Light" w:eastAsia="Lato Light" w:hAnsi="Lato Light"/>
-            <w:color w:val="1aa6b7"/>
-            <w:sz w:val="22"/>
-            <w:szCs w:val="22"/>
-            <w:rtl w:val="0"/>
-          </w:rPr>
-          <w:t xml:space="preserve">Informações gerais</w:t>
-        </w:r>
-      </w:hyperlink>
+      <w:r>
+        <w:rPr>
+          <w:rFonts w:ascii="Lato Light" w:cs="Lato Light" w:eastAsia="Lato Light" w:hAnsi="Lato Light"/>
+          <w:color w:val="1aa6b7"/>
+          <w:sz w:val="22"/>
+          <w:szCs w:val="22"/>
+          <w:rtl w:val="0"/>
+        </w:rPr>
+        <w:t xml:space="preserve">Informações gerais</w:t>
+      </w:r>
     </w:p>
     <w:p>
       <w:pPr>
@@ -1580,18 +1570,16 @@
         <w:ind w:left="240"/>
         <w:jc w:val="left"/>
       </w:pPr>
-      <w:hyperlink w:anchor="sec_visao_448c7c">
-        <w:r>
-          <w:rPr>
-            <w:rFonts w:ascii="Lato Light" w:cs="Lato Light" w:eastAsia="Lato Light" w:hAnsi="Lato Light"/>
-            <w:color w:val="1aa6b7"/>
-            <w:sz w:val="22"/>
-            <w:szCs w:val="22"/>
-            <w:rtl w:val="0"/>
-          </w:rPr>
-          <w:t xml:space="preserve">Visão geral do modelo</w:t>
-        </w:r>
-      </w:hyperlink>
+      <w:r>
+        <w:rPr>
+          <w:rFonts w:ascii="Lato Light" w:cs="Lato Light" w:eastAsia="Lato Light" w:hAnsi="Lato Light"/>
+          <w:color w:val="1aa6b7"/>
+          <w:sz w:val="22"/>
+          <w:szCs w:val="22"/>
+          <w:rtl w:val="0"/>
+        </w:rPr>
+        <w:t xml:space="preserve">Visão geral do modelo</w:t>
+      </w:r>
     </w:p>
     <w:p>
       <w:pPr>
@@ -1599,18 +1587,16 @@
         <w:ind w:left="240"/>
         <w:jc w:val="left"/>
       </w:pPr>
-      <w:hyperlink w:anchor="sec_modelo_18d738">
-        <w:r>
-          <w:rPr>
-            <w:rFonts w:ascii="Lato Light" w:cs="Lato Light" w:eastAsia="Lato Light" w:hAnsi="Lato Light"/>
-            <w:color w:val="1aa6b7"/>
-            <w:sz w:val="22"/>
-            <w:szCs w:val="22"/>
-            <w:rtl w:val="0"/>
-          </w:rPr>
-          <w:t xml:space="preserve">Modelo relacional</w:t>
-        </w:r>
-      </w:hyperlink>
+      <w:r>
+        <w:rPr>
+          <w:rFonts w:ascii="Lato Light" w:cs="Lato Light" w:eastAsia="Lato Light" w:hAnsi="Lato Light"/>
+          <w:color w:val="1aa6b7"/>
+          <w:sz w:val="22"/>
+          <w:szCs w:val="22"/>
+          <w:rtl w:val="0"/>
+        </w:rPr>
+        <w:t xml:space="preserve">Modelo relacional</w:t>
+      </w:r>
     </w:p>
     <w:p>
       <w:pPr>
@@ -1618,18 +1604,16 @@
         <w:ind w:left="240"/>
         <w:jc w:val="left"/>
       </w:pPr>
-      <w:hyperlink w:anchor="sec_tabelas_9f6cf3">
-        <w:r>
-          <w:rPr>
-            <w:rFonts w:ascii="Lato Light" w:cs="Lato Light" w:eastAsia="Lato Light" w:hAnsi="Lato Light"/>
-            <w:color w:val="1aa6b7"/>
-            <w:sz w:val="22"/>
-            <w:szCs w:val="22"/>
-            <w:rtl w:val="0"/>
-          </w:rPr>
-          <w:t xml:space="preserve">Tabelas</w:t>
-        </w:r>
-      </w:hyperlink>
+      <w:r>
+        <w:rPr>
+          <w:rFonts w:ascii="Lato Light" w:cs="Lato Light" w:eastAsia="Lato Light" w:hAnsi="Lato Light"/>
+          <w:color w:val="1aa6b7"/>
+          <w:sz w:val="22"/>
+          <w:szCs w:val="22"/>
+          <w:rtl w:val="0"/>
+        </w:rPr>
+        <w:t xml:space="preserve">Tabelas</w:t>
+      </w:r>
     </w:p>
     <w:p>
       <w:pPr>
@@ -1637,18 +1621,16 @@
         <w:ind w:left="240"/>
         <w:jc w:val="left"/>
       </w:pPr>
-      <w:hyperlink w:anchor="sec_medidas_3f01bf">
-        <w:r>
-          <w:rPr>
-            <w:rFonts w:ascii="Lato Light" w:cs="Lato Light" w:eastAsia="Lato Light" w:hAnsi="Lato Light"/>
-            <w:color w:val="1aa6b7"/>
-            <w:sz w:val="22"/>
-            <w:szCs w:val="22"/>
-            <w:rtl w:val="0"/>
-          </w:rPr>
-          <w:t xml:space="preserve">Medidas</w:t>
-        </w:r>
-      </w:hyperlink>
+      <w:r>
+        <w:rPr>
+          <w:rFonts w:ascii="Lato Light" w:cs="Lato Light" w:eastAsia="Lato Light" w:hAnsi="Lato Light"/>
+          <w:color w:val="1aa6b7"/>
+          <w:sz w:val="22"/>
+          <w:szCs w:val="22"/>
+          <w:rtl w:val="0"/>
+        </w:rPr>
+        <w:t xml:space="preserve">Medidas</w:t>
+      </w:r>
     </w:p>
     <w:p>
       <w:pPr>
@@ -1656,18 +1638,16 @@
         <w:ind w:left="240"/>
         <w:jc w:val="left"/>
       </w:pPr>
-      <w:hyperlink w:anchor="sec_queries_fd7ec4">
-        <w:r>
-          <w:rPr>
-            <w:rFonts w:ascii="Lato Light" w:cs="Lato Light" w:eastAsia="Lato Light" w:hAnsi="Lato Light"/>
-            <w:color w:val="1aa6b7"/>
-            <w:sz w:val="22"/>
-            <w:szCs w:val="22"/>
-            <w:rtl w:val="0"/>
-          </w:rPr>
-          <w:t xml:space="preserve">Queries M (Power Query)</w:t>
-        </w:r>
-      </w:hyperlink>
+      <w:r>
+        <w:rPr>
+          <w:rFonts w:ascii="Lato Light" w:cs="Lato Light" w:eastAsia="Lato Light" w:hAnsi="Lato Light"/>
+          <w:color w:val="1aa6b7"/>
+          <w:sz w:val="22"/>
+          <w:szCs w:val="22"/>
+          <w:rtl w:val="0"/>
+        </w:rPr>
+        <w:t xml:space="preserve">Queries M (Power Query)</w:t>
+      </w:r>
     </w:p>
     <w:p>
       <w:pPr>
@@ -1675,18 +1655,16 @@
         <w:ind w:left="240"/>
         <w:jc w:val="left"/>
       </w:pPr>
-      <w:hyperlink w:anchor="sec_rls_01c39e">
-        <w:r>
-          <w:rPr>
-            <w:rFonts w:ascii="Lato Light" w:cs="Lato Light" w:eastAsia="Lato Light" w:hAnsi="Lato Light"/>
-            <w:color w:val="1aa6b7"/>
-            <w:sz w:val="22"/>
-            <w:szCs w:val="22"/>
-            <w:rtl w:val="0"/>
-          </w:rPr>
-          <w:t xml:space="preserve">Segurança em nível de linha (RLS)</w:t>
-        </w:r>
-      </w:hyperlink>
+      <w:r>
+        <w:rPr>
+          <w:rFonts w:ascii="Lato Light" w:cs="Lato Light" w:eastAsia="Lato Light" w:hAnsi="Lato Light"/>
+          <w:color w:val="1aa6b7"/>
+          <w:sz w:val="22"/>
+          <w:szCs w:val="22"/>
+          <w:rtl w:val="0"/>
+        </w:rPr>
+        <w:t xml:space="preserve">Segurança em nível de linha (RLS)</w:t>
+      </w:r>
     </w:p>
     <w:p>
       <w:pPr>
@@ -1709,18 +1687,16 @@
         <w:ind w:left="240"/>
         <w:jc w:val="left"/>
       </w:pPr>
-      <w:hyperlink w:anchor="tabela__matriculas_be697b">
-        <w:r>
-          <w:rPr>
-            <w:rFonts w:ascii="Lato Light" w:cs="Lato Light" w:eastAsia="Lato Light" w:hAnsi="Lato Light"/>
-            <w:color w:val="1aa6b7"/>
-            <w:sz w:val="22"/>
-            <w:szCs w:val="22"/>
-            <w:rtl w:val="0"/>
-          </w:rPr>
-          <w:t xml:space="preserve">matriculas</w:t>
-        </w:r>
-      </w:hyperlink>
+      <w:r>
+        <w:rPr>
+          <w:rFonts w:ascii="Lato Light" w:cs="Lato Light" w:eastAsia="Lato Light" w:hAnsi="Lato Light"/>
+          <w:color w:val="1aa6b7"/>
+          <w:sz w:val="22"/>
+          <w:szCs w:val="22"/>
+          <w:rtl w:val="0"/>
+        </w:rPr>
+        <w:t xml:space="preserve">matriculas</w:t>
+      </w:r>
     </w:p>
     <w:p>
       <w:pPr>
@@ -1728,18 +1704,16 @@
         <w:ind w:left="240"/>
         <w:jc w:val="left"/>
       </w:pPr>
-      <w:hyperlink w:anchor="tabela__cursos_09047a">
-        <w:r>
-          <w:rPr>
-            <w:rFonts w:ascii="Lato Light" w:cs="Lato Light" w:eastAsia="Lato Light" w:hAnsi="Lato Light"/>
-            <w:color w:val="1aa6b7"/>
-            <w:sz w:val="22"/>
-            <w:szCs w:val="22"/>
-            <w:rtl w:val="0"/>
-          </w:rPr>
-          <w:t xml:space="preserve">cursos</w:t>
-        </w:r>
-      </w:hyperlink>
+      <w:r>
+        <w:rPr>
+          <w:rFonts w:ascii="Lato Light" w:cs="Lato Light" w:eastAsia="Lato Light" w:hAnsi="Lato Light"/>
+          <w:color w:val="1aa6b7"/>
+          <w:sz w:val="22"/>
+          <w:szCs w:val="22"/>
+          <w:rtl w:val="0"/>
+        </w:rPr>
+        <w:t xml:space="preserve">cursos</w:t>
+      </w:r>
     </w:p>
     <w:p>
       <w:pPr>
@@ -1747,18 +1721,16 @@
         <w:ind w:left="240"/>
         <w:jc w:val="left"/>
       </w:pPr>
-      <w:hyperlink w:anchor="tabela__Medidas_a182b0">
-        <w:r>
-          <w:rPr>
-            <w:rFonts w:ascii="Lato Light" w:cs="Lato Light" w:eastAsia="Lato Light" w:hAnsi="Lato Light"/>
-            <w:color w:val="1aa6b7"/>
-            <w:sz w:val="22"/>
-            <w:szCs w:val="22"/>
-            <w:rtl w:val="0"/>
-          </w:rPr>
-          <w:t xml:space="preserve">Medidas</w:t>
-        </w:r>
-      </w:hyperlink>
+      <w:r>
+        <w:rPr>
+          <w:rFonts w:ascii="Lato Light" w:cs="Lato Light" w:eastAsia="Lato Light" w:hAnsi="Lato Light"/>
+          <w:color w:val="1aa6b7"/>
+          <w:sz w:val="22"/>
+          <w:szCs w:val="22"/>
+          <w:rtl w:val="0"/>
+        </w:rPr>
+        <w:t xml:space="preserve">Medidas</w:t>
+      </w:r>
     </w:p>
     <w:p>
       <w:pPr>
@@ -1781,18 +1753,16 @@
         <w:ind w:left="240"/>
         <w:jc w:val="left"/>
       </w:pPr>
-      <w:hyperlink w:anchor="medida__Medidas__N__de_Matr_cula_bece58">
-        <w:r>
-          <w:rPr>
-            <w:rFonts w:ascii="Lato Light" w:cs="Lato Light" w:eastAsia="Lato Light" w:hAnsi="Lato Light"/>
-            <w:color w:val="1aa6b7"/>
-            <w:sz w:val="22"/>
-            <w:szCs w:val="22"/>
-            <w:rtl w:val="0"/>
-          </w:rPr>
-          <w:t xml:space="preserve">Nº de Matrículas  (Medidas)</w:t>
-        </w:r>
-      </w:hyperlink>
+      <w:r>
+        <w:rPr>
+          <w:rFonts w:ascii="Lato Light" w:cs="Lato Light" w:eastAsia="Lato Light" w:hAnsi="Lato Light"/>
+          <w:color w:val="1aa6b7"/>
+          <w:sz w:val="22"/>
+          <w:szCs w:val="22"/>
+          <w:rtl w:val="0"/>
+        </w:rPr>
+        <w:t xml:space="preserve">Nº de Matrículas  (Medidas)</w:t>
+      </w:r>
     </w:p>
     <w:p>
       <w:pPr>
@@ -1800,26 +1770,22 @@
         <w:ind w:left="240"/>
         <w:jc w:val="left"/>
       </w:pPr>
-      <w:hyperlink w:anchor="medida__Medidas__N__de_Ativos_b49c4a">
-        <w:r>
-          <w:rPr>
-            <w:rFonts w:ascii="Lato Light" w:cs="Lato Light" w:eastAsia="Lato Light" w:hAnsi="Lato Light"/>
-            <w:color w:val="1aa6b7"/>
-            <w:sz w:val="22"/>
-            <w:szCs w:val="22"/>
-            <w:rtl w:val="0"/>
-          </w:rPr>
-          <w:t xml:space="preserve">Nº de Ativos  (Medidas)</w:t>
-        </w:r>
-      </w:hyperlink>
+      <w:r>
+        <w:rPr>
+          <w:rFonts w:ascii="Lato Light" w:cs="Lato Light" w:eastAsia="Lato Light" w:hAnsi="Lato Light"/>
+          <w:color w:val="1aa6b7"/>
+          <w:sz w:val="22"/>
+          <w:szCs w:val="22"/>
+          <w:rtl w:val="0"/>
+        </w:rPr>
+        <w:t xml:space="preserve">Nº de Ativos  (Medidas)</w:t>
+      </w:r>
     </w:p>
     <w:p>
       <w:pPr>
         <w:pStyle w:val="Heading1"/>
         <w:pageBreakBefore w:val="1"/>
       </w:pPr>
-      <w:bookmarkStart w:colFirst="0" w:colLast="0" w:name="sec_visao_448c7c" w:id="4"/>
-      <w:bookmarkEnd w:id="4"/>
       <w:r>
         <w:rPr>
           <w:rFonts w:ascii="Lato" w:cs="Lato" w:eastAsia="Lato" w:hAnsi="Lato"/>
@@ -1870,8 +1836,6 @@
         <w:pStyle w:val="Heading1"/>
         <w:pageBreakBefore w:val="1"/>
       </w:pPr>
-      <w:bookmarkStart w:colFirst="0" w:colLast="0" w:name="sec_modelo_18d738" w:id="5"/>
-      <w:bookmarkEnd w:id="5"/>
       <w:r>
         <w:rPr>
           <w:rFonts w:ascii="Lato" w:cs="Lato" w:eastAsia="Lato" w:hAnsi="Lato"/>
@@ -2251,8 +2215,6 @@
         <w:pStyle w:val="Heading1"/>
         <w:pageBreakBefore w:val="1"/>
       </w:pPr>
-      <w:bookmarkStart w:colFirst="0" w:colLast="0" w:name="sec_tabelas_9f6cf3" w:id="6"/>
-      <w:bookmarkEnd w:id="6"/>
       <w:r>
         <w:rPr>
           <w:rFonts w:ascii="Lato" w:cs="Lato" w:eastAsia="Lato" w:hAnsi="Lato"/>
@@ -2699,8 +2661,6 @@
         <w:pStyle w:val="Heading2"/>
         <w:spacing w:line="276" w:lineRule="auto"/>
       </w:pPr>
-      <w:bookmarkStart w:colFirst="0" w:colLast="0" w:name="tabela__matriculas_be697b" w:id="7"/>
-      <w:bookmarkEnd w:id="7"/>
       <w:r>
         <w:rPr>
           <w:rFonts w:ascii="Lato" w:cs="Lato" w:eastAsia="Lato" w:hAnsi="Lato"/>
@@ -3652,8 +3612,6 @@
         <w:pStyle w:val="Heading2"/>
         <w:spacing w:line="276" w:lineRule="auto"/>
       </w:pPr>
-      <w:bookmarkStart w:colFirst="0" w:colLast="0" w:name="tabela__cursos_09047a" w:id="8"/>
-      <w:bookmarkEnd w:id="8"/>
       <w:r>
         <w:rPr>
           <w:rFonts w:ascii="Lato" w:cs="Lato" w:eastAsia="Lato" w:hAnsi="Lato"/>
@@ -4327,8 +4285,6 @@
         <w:pStyle w:val="Heading2"/>
         <w:spacing w:line="276" w:lineRule="auto"/>
       </w:pPr>
-      <w:bookmarkStart w:colFirst="0" w:colLast="0" w:name="tabela__Medidas_a182b0" w:id="9"/>
-      <w:bookmarkEnd w:id="9"/>
       <w:r>
         <w:rPr>
           <w:rFonts w:ascii="Lato" w:cs="Lato" w:eastAsia="Lato" w:hAnsi="Lato"/>
@@ -4575,8 +4531,6 @@
         <w:pStyle w:val="Heading1"/>
         <w:pageBreakBefore w:val="1"/>
       </w:pPr>
-      <w:bookmarkStart w:colFirst="0" w:colLast="0" w:name="sec_medidas_3f01bf" w:id="10"/>
-      <w:bookmarkEnd w:id="10"/>
       <w:r>
         <w:rPr>
           <w:rFonts w:ascii="Lato" w:cs="Lato" w:eastAsia="Lato" w:hAnsi="Lato"/>
@@ -4628,8 +4582,6 @@
       <w:pPr>
         <w:pStyle w:val="Heading3"/>
       </w:pPr>
-      <w:bookmarkStart w:colFirst="0" w:colLast="0" w:name="medida__Medidas__N__de_Matr_cula_bece58" w:id="11"/>
-      <w:bookmarkEnd w:id="11"/>
       <w:r>
         <w:rPr>
           <w:rFonts w:ascii="Lato" w:cs="Lato" w:eastAsia="Lato" w:hAnsi="Lato"/>
@@ -4897,8 +4849,6 @@
       <w:pPr>
         <w:pStyle w:val="Heading3"/>
       </w:pPr>
-      <w:bookmarkStart w:colFirst="0" w:colLast="0" w:name="medida__Medidas__N__de_Ativos_b49c4a" w:id="12"/>
-      <w:bookmarkEnd w:id="12"/>
       <w:r>
         <w:rPr>
           <w:rFonts w:ascii="Lato" w:cs="Lato" w:eastAsia="Lato" w:hAnsi="Lato"/>
@@ -5173,8 +5123,6 @@
         <w:pStyle w:val="Heading1"/>
         <w:pageBreakBefore w:val="1"/>
       </w:pPr>
-      <w:bookmarkStart w:colFirst="0" w:colLast="0" w:name="sec_queries_fd7ec4" w:id="13"/>
-      <w:bookmarkEnd w:id="13"/>
       <w:r>
         <w:rPr>
           <w:rFonts w:ascii="Lato" w:cs="Lato" w:eastAsia="Lato" w:hAnsi="Lato"/>
@@ -5610,8 +5558,6 @@
         <w:pStyle w:val="Heading2"/>
         <w:spacing w:line="276" w:lineRule="auto"/>
       </w:pPr>
-      <w:bookmarkStart w:colFirst="0" w:colLast="0" w:name="m__matriculas_bea1ba" w:id="14"/>
-      <w:bookmarkEnd w:id="14"/>
       <w:r>
         <w:rPr>
           <w:rFonts w:ascii="Lato" w:cs="Lato" w:eastAsia="Lato" w:hAnsi="Lato"/>
@@ -6057,8 +6003,6 @@
         <w:pStyle w:val="Heading2"/>
         <w:spacing w:line="276" w:lineRule="auto"/>
       </w:pPr>
-      <w:bookmarkStart w:colFirst="0" w:colLast="0" w:name="m__cursos_d0e001" w:id="15"/>
-      <w:bookmarkEnd w:id="15"/>
       <w:r>
         <w:rPr>
           <w:rFonts w:ascii="Lato" w:cs="Lato" w:eastAsia="Lato" w:hAnsi="Lato"/>
@@ -6408,8 +6352,6 @@
         <w:pStyle w:val="Heading1"/>
         <w:pageBreakBefore w:val="1"/>
       </w:pPr>
-      <w:bookmarkStart w:colFirst="0" w:colLast="0" w:name="sec_rls_01c39e" w:id="16"/>
-      <w:bookmarkEnd w:id="16"/>
       <w:r>
         <w:rPr>
           <w:rFonts w:ascii="Lato" w:cs="Lato" w:eastAsia="Lato" w:hAnsi="Lato"/>
@@ -6672,8 +6614,6 @@
         <w:pStyle w:val="Heading2"/>
         <w:spacing w:line="276" w:lineRule="auto"/>
       </w:pPr>
-      <w:bookmarkStart w:colFirst="0" w:colLast="0" w:name="rls__Responsavel_868b43" w:id="17"/>
-      <w:bookmarkEnd w:id="17"/>
       <w:r>
         <w:rPr>
           <w:rFonts w:ascii="Lato" w:cs="Lato" w:eastAsia="Lato" w:hAnsi="Lato"/>

</xml_diff>